<commit_message>
Stesura finale SDD e varie modifiche di rifinimento ad altri documenti
</commit_message>
<xml_diff>
--- a/Deliverables/ClickFly - RequirementAnalysisDocument(RAD).docx
+++ b/Deliverables/ClickFly - RequirementAnalysisDocument(RAD).docx
@@ -154,7 +154,6 @@
           <w:szCs w:val="36"/>
         </w:rPr>
       </w:pPr>
-      <w:proofErr w:type="spellStart"/>
       <w:r>
         <w:rPr>
           <w:rFonts w:ascii="Arial" w:eastAsia="Arial" w:hAnsi="Arial" w:cs="Arial"/>
@@ -165,7 +164,6 @@
         </w:rPr>
         <w:t>ClickFly</w:t>
       </w:r>
-      <w:proofErr w:type="spellEnd"/>
       <w:r>
         <w:rPr>
           <w:rFonts w:ascii="Arial" w:eastAsia="Arial" w:hAnsi="Arial" w:cs="Arial"/>
@@ -175,50 +173,7 @@
           <w:szCs w:val="36"/>
         </w:rPr>
         <w:br/>
-      </w:r>
-      <w:proofErr w:type="spellStart"/>
-      <w:r>
-        <w:rPr>
-          <w:rFonts w:ascii="Arial" w:eastAsia="Arial" w:hAnsi="Arial" w:cs="Arial"/>
-          <w:b/>
-          <w:bCs/>
-          <w:sz w:val="36"/>
-          <w:szCs w:val="36"/>
-        </w:rPr>
-        <w:t>Requirement</w:t>
-      </w:r>
-      <w:proofErr w:type="spellEnd"/>
-      <w:r>
-        <w:rPr>
-          <w:rFonts w:ascii="Arial" w:eastAsia="Arial" w:hAnsi="Arial" w:cs="Arial"/>
-          <w:b/>
-          <w:bCs/>
-          <w:sz w:val="36"/>
-          <w:szCs w:val="36"/>
-        </w:rPr>
-        <w:t xml:space="preserve"> Analysis </w:t>
-      </w:r>
-      <w:proofErr w:type="spellStart"/>
-      <w:r>
-        <w:rPr>
-          <w:rFonts w:ascii="Arial" w:eastAsia="Arial" w:hAnsi="Arial" w:cs="Arial"/>
-          <w:b/>
-          <w:bCs/>
-          <w:sz w:val="36"/>
-          <w:szCs w:val="36"/>
-        </w:rPr>
-        <w:t>Document</w:t>
-      </w:r>
-      <w:proofErr w:type="spellEnd"/>
-      <w:r>
-        <w:rPr>
-          <w:rFonts w:ascii="Arial" w:eastAsia="Arial" w:hAnsi="Arial" w:cs="Arial"/>
-          <w:b/>
-          <w:bCs/>
-          <w:sz w:val="36"/>
-          <w:szCs w:val="36"/>
-        </w:rPr>
-        <w:t xml:space="preserve"> (RAD)</w:t>
+        <w:t>Requirement Analysis Document (RAD)</w:t>
       </w:r>
       <w:r>
         <w:rPr>
@@ -810,7 +765,6 @@
           <w:szCs w:val="32"/>
         </w:rPr>
       </w:pPr>
-      <w:proofErr w:type="spellStart"/>
       <w:r>
         <w:rPr>
           <w:rFonts w:ascii="Arial" w:eastAsia="Arial" w:hAnsi="Arial" w:cs="Arial"/>
@@ -819,18 +773,7 @@
           <w:sz w:val="32"/>
           <w:szCs w:val="32"/>
         </w:rPr>
-        <w:t>Revision</w:t>
-      </w:r>
-      <w:proofErr w:type="spellEnd"/>
-      <w:r>
-        <w:rPr>
-          <w:rFonts w:ascii="Arial" w:eastAsia="Arial" w:hAnsi="Arial" w:cs="Arial"/>
-          <w:b/>
-          <w:bCs/>
-          <w:sz w:val="32"/>
-          <w:szCs w:val="32"/>
-        </w:rPr>
-        <w:t xml:space="preserve"> History</w:t>
+        <w:t>Revision History</w:t>
       </w:r>
     </w:p>
     <w:tbl>
@@ -1164,13 +1107,8 @@
               <w:widowControl w:val="0"/>
             </w:pPr>
             <w:r>
-              <w:t xml:space="preserve">Aggiunta state chart </w:t>
-            </w:r>
-            <w:proofErr w:type="spellStart"/>
-            <w:r>
-              <w:t>diagram</w:t>
-            </w:r>
-            <w:proofErr w:type="spellEnd"/>
+              <w:t>Aggiunta state chart diagram</w:t>
+            </w:r>
           </w:p>
         </w:tc>
         <w:tc>
@@ -1187,17 +1125,7 @@
               <w:widowControl w:val="0"/>
             </w:pPr>
             <w:r>
-              <w:t xml:space="preserve">Fabio </w:t>
-            </w:r>
-            <w:proofErr w:type="spellStart"/>
-            <w:proofErr w:type="gramStart"/>
-            <w:r>
-              <w:t>Pennarella,Giusy</w:t>
-            </w:r>
-            <w:proofErr w:type="spellEnd"/>
-            <w:proofErr w:type="gramEnd"/>
-            <w:r>
-              <w:t xml:space="preserve"> Chierchia</w:t>
+              <w:t>Fabio Pennarella,Giusy Chierchia</w:t>
             </w:r>
           </w:p>
         </w:tc>
@@ -1254,25 +1182,8 @@
               <w:widowControl w:val="0"/>
             </w:pPr>
             <w:r>
-              <w:t xml:space="preserve">Aggiunti </w:t>
-            </w:r>
-            <w:proofErr w:type="spellStart"/>
-            <w:proofErr w:type="gramStart"/>
-            <w:r>
-              <w:t>scenari,sequence</w:t>
-            </w:r>
-            <w:proofErr w:type="spellEnd"/>
-            <w:proofErr w:type="gramEnd"/>
-            <w:r>
-              <w:t xml:space="preserve"> e activity </w:t>
-            </w:r>
-            <w:proofErr w:type="spellStart"/>
-            <w:proofErr w:type="gramStart"/>
-            <w:r>
-              <w:t>diagrams,glossario</w:t>
-            </w:r>
-            <w:proofErr w:type="spellEnd"/>
-            <w:proofErr w:type="gramEnd"/>
+              <w:t>Aggiunti scenari,sequence e activity diagrams,glossario</w:t>
+            </w:r>
           </w:p>
         </w:tc>
         <w:tc>
@@ -1289,17 +1200,7 @@
               <w:widowControl w:val="0"/>
             </w:pPr>
             <w:r>
-              <w:t xml:space="preserve">Fabio </w:t>
-            </w:r>
-            <w:proofErr w:type="spellStart"/>
-            <w:proofErr w:type="gramStart"/>
-            <w:r>
-              <w:t>Pennarella,Giusy</w:t>
-            </w:r>
-            <w:proofErr w:type="spellEnd"/>
-            <w:proofErr w:type="gramEnd"/>
-            <w:r>
-              <w:t xml:space="preserve"> Chierchia</w:t>
+              <w:t>Fabio Pennarella,Giusy Chierchia</w:t>
             </w:r>
           </w:p>
         </w:tc>
@@ -1374,17 +1275,7 @@
               <w:widowControl w:val="0"/>
             </w:pPr>
             <w:r>
-              <w:t xml:space="preserve">Fabio </w:t>
-            </w:r>
-            <w:proofErr w:type="spellStart"/>
-            <w:proofErr w:type="gramStart"/>
-            <w:r>
-              <w:t>Pennarella,Giusy</w:t>
-            </w:r>
-            <w:proofErr w:type="spellEnd"/>
-            <w:proofErr w:type="gramEnd"/>
-            <w:r>
-              <w:t xml:space="preserve"> Chierchia</w:t>
+              <w:t>Fabio Pennarella,Giusy Chierchia</w:t>
             </w:r>
           </w:p>
         </w:tc>
@@ -1569,7 +1460,6 @@
         </w:rPr>
         <w:t xml:space="preserve">Il sistema, denominato </w:t>
       </w:r>
-      <w:proofErr w:type="spellStart"/>
       <w:r>
         <w:rPr>
           <w:b/>
@@ -1579,7 +1469,6 @@
         </w:rPr>
         <w:t>ClickFly</w:t>
       </w:r>
-      <w:proofErr w:type="spellEnd"/>
       <w:r>
         <w:rPr>
           <w:sz w:val="24"/>
@@ -1598,21 +1487,12 @@
           <w:szCs w:val="24"/>
         </w:rPr>
       </w:pPr>
-      <w:proofErr w:type="spellStart"/>
-      <w:r>
-        <w:rPr>
-          <w:sz w:val="24"/>
-          <w:szCs w:val="24"/>
-        </w:rPr>
-        <w:t>ClickFly</w:t>
-      </w:r>
-      <w:proofErr w:type="spellEnd"/>
-      <w:r>
-        <w:rPr>
-          <w:sz w:val="24"/>
-          <w:szCs w:val="24"/>
-        </w:rPr>
-        <w:t xml:space="preserve"> mira a diventare un punto di riferimento per gli utenti che desiderano pianificare i propri viaggi in maniera efficiente, offrendo un’interfaccia chiara e funzionalità mirate alla gestione completa del processo di prenotazione, dalla ricerca iniziale fino alla visualizzazione delle prenotazioni effettuate.</w:t>
+      <w:r>
+        <w:rPr>
+          <w:sz w:val="24"/>
+          <w:szCs w:val="24"/>
+        </w:rPr>
+        <w:t>ClickFly mira a diventare un punto di riferimento per gli utenti che desiderano pianificare i propri viaggi in maniera efficiente, offrendo un’interfaccia chiara e funzionalità mirate alla gestione completa del processo di prenotazione, dalla ricerca iniziale fino alla visualizzazione delle prenotazioni effettuate.</w:t>
       </w:r>
     </w:p>
     <w:p>
@@ -1663,21 +1543,12 @@
           <w:szCs w:val="24"/>
         </w:rPr>
       </w:pPr>
-      <w:proofErr w:type="spellStart"/>
-      <w:r>
-        <w:rPr>
-          <w:sz w:val="24"/>
-          <w:szCs w:val="24"/>
-        </w:rPr>
-        <w:t>ClickFly</w:t>
-      </w:r>
-      <w:proofErr w:type="spellEnd"/>
-      <w:r>
-        <w:rPr>
-          <w:sz w:val="24"/>
-          <w:szCs w:val="24"/>
-        </w:rPr>
-        <w:t xml:space="preserve"> è una </w:t>
+      <w:r>
+        <w:rPr>
+          <w:sz w:val="24"/>
+          <w:szCs w:val="24"/>
+        </w:rPr>
+        <w:t xml:space="preserve">ClickFly è una </w:t>
       </w:r>
       <w:r>
         <w:rPr>
@@ -2342,7 +2213,6 @@
           <w:szCs w:val="24"/>
         </w:rPr>
       </w:pPr>
-      <w:proofErr w:type="spellStart"/>
       <w:r>
         <w:rPr>
           <w:b/>
@@ -2352,7 +2222,6 @@
         </w:rPr>
         <w:t>ClickFly</w:t>
       </w:r>
-      <w:proofErr w:type="spellEnd"/>
       <w:r>
         <w:rPr>
           <w:sz w:val="24"/>
@@ -2629,23 +2498,7 @@
           <w:sz w:val="24"/>
           <w:szCs w:val="24"/>
         </w:rPr>
-        <w:t xml:space="preserve">Il sistema </w:t>
-      </w:r>
-      <w:proofErr w:type="spellStart"/>
-      <w:r>
-        <w:rPr>
-          <w:sz w:val="24"/>
-          <w:szCs w:val="24"/>
-        </w:rPr>
-        <w:t>ClickFly</w:t>
-      </w:r>
-      <w:proofErr w:type="spellEnd"/>
-      <w:r>
-        <w:rPr>
-          <w:sz w:val="24"/>
-          <w:szCs w:val="24"/>
-        </w:rPr>
-        <w:t xml:space="preserve"> si ispira ai principali portali di prenotazione voli attualmente presenti sul mercato, adattandone le funzionalità a un contesto didattic</w:t>
+        <w:t>Il sistema ClickFly si ispira ai principali portali di prenotazione voli attualmente presenti sul mercato, adattandone le funzionalità a un contesto didattic</w:t>
       </w:r>
       <w:r>
         <w:rPr>
@@ -4621,9 +4474,25 @@
           <w:szCs w:val="28"/>
           <w:lang w:val="it-IT"/>
         </w:rPr>
-        <w:t xml:space="preserve">Effettuare una ricerca voli in non più di </w:t>
-      </w:r>
-      <w:proofErr w:type="gramStart"/>
+        <w:t>Effettuare una ricerca voli in non più di 3 interazioni</w:t>
+      </w:r>
+    </w:p>
+    <w:p>
+      <w:pPr>
+        <w:pStyle w:val="Titolo2"/>
+        <w:keepNext w:val="0"/>
+        <w:keepLines w:val="0"/>
+        <w:widowControl w:val="0"/>
+        <w:numPr>
+          <w:ilvl w:val="1"/>
+          <w:numId w:val="40"/>
+        </w:numPr>
+        <w:jc w:val="both"/>
+        <w:rPr>
+          <w:sz w:val="34"/>
+          <w:szCs w:val="34"/>
+        </w:rPr>
+      </w:pPr>
       <w:r>
         <w:rPr>
           <w:b w:val="0"/>
@@ -4632,9 +4501,25 @@
           <w:szCs w:val="28"/>
           <w:lang w:val="it-IT"/>
         </w:rPr>
-        <w:t>3</w:t>
-      </w:r>
-      <w:proofErr w:type="gramEnd"/>
+        <w:t>Aggiungere un volo al carrello in non più di 2 interazioni</w:t>
+      </w:r>
+    </w:p>
+    <w:p>
+      <w:pPr>
+        <w:pStyle w:val="Titolo2"/>
+        <w:keepNext w:val="0"/>
+        <w:keepLines w:val="0"/>
+        <w:widowControl w:val="0"/>
+        <w:numPr>
+          <w:ilvl w:val="1"/>
+          <w:numId w:val="40"/>
+        </w:numPr>
+        <w:jc w:val="both"/>
+        <w:rPr>
+          <w:sz w:val="34"/>
+          <w:szCs w:val="34"/>
+        </w:rPr>
+      </w:pPr>
       <w:r>
         <w:rPr>
           <w:b w:val="0"/>
@@ -4643,7 +4528,7 @@
           <w:szCs w:val="28"/>
           <w:lang w:val="it-IT"/>
         </w:rPr>
-        <w:t xml:space="preserve"> interazioni</w:t>
+        <w:t>Completare un acquisto in non più di 3 interazioni a partire dal carrello</w:t>
       </w:r>
     </w:p>
     <w:p>
@@ -4653,7 +4538,7 @@
         <w:keepLines w:val="0"/>
         <w:widowControl w:val="0"/>
         <w:numPr>
-          <w:ilvl w:val="1"/>
+          <w:ilvl w:val="0"/>
           <w:numId w:val="40"/>
         </w:numPr>
         <w:jc w:val="both"/>
@@ -4670,9 +4555,25 @@
           <w:szCs w:val="28"/>
           <w:lang w:val="it-IT"/>
         </w:rPr>
-        <w:t xml:space="preserve">Aggiungere un volo al carrello in non più di </w:t>
-      </w:r>
-      <w:proofErr w:type="gramStart"/>
+        <w:t>Tutte le funzionalità principali devono essere accessibili senza la necessità di consultare una guida.</w:t>
+      </w:r>
+    </w:p>
+    <w:p>
+      <w:pPr>
+        <w:pStyle w:val="Titolo2"/>
+        <w:keepNext w:val="0"/>
+        <w:keepLines w:val="0"/>
+        <w:widowControl w:val="0"/>
+        <w:numPr>
+          <w:ilvl w:val="0"/>
+          <w:numId w:val="40"/>
+        </w:numPr>
+        <w:jc w:val="both"/>
+        <w:rPr>
+          <w:sz w:val="34"/>
+          <w:szCs w:val="34"/>
+        </w:rPr>
+      </w:pPr>
       <w:r>
         <w:rPr>
           <w:b w:val="0"/>
@@ -4681,9 +4582,56 @@
           <w:szCs w:val="28"/>
           <w:lang w:val="it-IT"/>
         </w:rPr>
-        <w:t>2</w:t>
-      </w:r>
-      <w:proofErr w:type="gramEnd"/>
+        <w:t>Il sistema deve essere utilizzabile correttamente sia da dispositivi desktop che mobili.</w:t>
+      </w:r>
+    </w:p>
+    <w:p>
+      <w:pPr>
+        <w:pStyle w:val="Titolo2"/>
+        <w:keepLines w:val="0"/>
+        <w:widowControl w:val="0"/>
+        <w:rPr>
+          <w:b w:val="0"/>
+          <w:bCs w:val="0"/>
+          <w:sz w:val="34"/>
+          <w:szCs w:val="34"/>
+        </w:rPr>
+      </w:pPr>
+      <w:r>
+        <w:rPr>
+          <w:sz w:val="34"/>
+          <w:szCs w:val="34"/>
+        </w:rPr>
+        <w:t>RNF4: Scalabilità</w:t>
+      </w:r>
+      <w:bookmarkStart w:id="21" w:name="_8ldwch89ppss" w:colFirst="0" w:colLast="0"/>
+      <w:bookmarkEnd w:id="21"/>
+      <w:r>
+        <w:rPr>
+          <w:b w:val="0"/>
+          <w:bCs w:val="0"/>
+          <w:sz w:val="34"/>
+          <w:szCs w:val="34"/>
+        </w:rPr>
+        <w:t xml:space="preserve"> – priorità bassa</w:t>
+      </w:r>
+    </w:p>
+    <w:p>
+      <w:pPr>
+        <w:pStyle w:val="Titolo2"/>
+        <w:keepLines w:val="0"/>
+        <w:widowControl w:val="0"/>
+        <w:numPr>
+          <w:ilvl w:val="0"/>
+          <w:numId w:val="41"/>
+        </w:numPr>
+        <w:rPr>
+          <w:b w:val="0"/>
+          <w:bCs w:val="0"/>
+          <w:sz w:val="34"/>
+          <w:szCs w:val="34"/>
+        </w:rPr>
+      </w:pPr>
       <w:r>
         <w:rPr>
           <w:b w:val="0"/>
@@ -4692,21 +4640,21 @@
           <w:szCs w:val="28"/>
           <w:lang w:val="it-IT"/>
         </w:rPr>
-        <w:t xml:space="preserve"> interazioni</w:t>
+        <w:t>Il sistema deve essere in grado di gestire almeno:</w:t>
       </w:r>
     </w:p>
     <w:p>
       <w:pPr>
         <w:pStyle w:val="Titolo2"/>
-        <w:keepNext w:val="0"/>
         <w:keepLines w:val="0"/>
         <w:widowControl w:val="0"/>
         <w:numPr>
           <w:ilvl w:val="1"/>
-          <w:numId w:val="40"/>
+          <w:numId w:val="41"/>
         </w:numPr>
-        <w:jc w:val="both"/>
-        <w:rPr>
+        <w:rPr>
+          <w:b w:val="0"/>
+          <w:bCs w:val="0"/>
           <w:sz w:val="34"/>
           <w:szCs w:val="34"/>
         </w:rPr>
@@ -4719,9 +4667,25 @@
           <w:szCs w:val="28"/>
           <w:lang w:val="it-IT"/>
         </w:rPr>
-        <w:t xml:space="preserve">Completare un acquisto in non più di </w:t>
-      </w:r>
-      <w:proofErr w:type="gramStart"/>
+        <w:t>1.000 utenti registrati</w:t>
+      </w:r>
+    </w:p>
+    <w:p>
+      <w:pPr>
+        <w:pStyle w:val="Titolo2"/>
+        <w:keepLines w:val="0"/>
+        <w:widowControl w:val="0"/>
+        <w:numPr>
+          <w:ilvl w:val="1"/>
+          <w:numId w:val="41"/>
+        </w:numPr>
+        <w:rPr>
+          <w:b w:val="0"/>
+          <w:bCs w:val="0"/>
+          <w:sz w:val="34"/>
+          <w:szCs w:val="34"/>
+        </w:rPr>
+      </w:pPr>
       <w:r>
         <w:rPr>
           <w:b w:val="0"/>
@@ -4730,9 +4694,25 @@
           <w:szCs w:val="28"/>
           <w:lang w:val="it-IT"/>
         </w:rPr>
-        <w:t>3</w:t>
-      </w:r>
-      <w:proofErr w:type="gramEnd"/>
+        <w:t>100 utenti contemporanei</w:t>
+      </w:r>
+    </w:p>
+    <w:p>
+      <w:pPr>
+        <w:pStyle w:val="Titolo2"/>
+        <w:keepLines w:val="0"/>
+        <w:widowControl w:val="0"/>
+        <w:numPr>
+          <w:ilvl w:val="1"/>
+          <w:numId w:val="41"/>
+        </w:numPr>
+        <w:rPr>
+          <w:b w:val="0"/>
+          <w:bCs w:val="0"/>
+          <w:sz w:val="34"/>
+          <w:szCs w:val="34"/>
+        </w:rPr>
+      </w:pPr>
       <w:r>
         <w:rPr>
           <w:b w:val="0"/>
@@ -4741,21 +4721,21 @@
           <w:szCs w:val="28"/>
           <w:lang w:val="it-IT"/>
         </w:rPr>
-        <w:t xml:space="preserve"> interazioni a partire dal carrello</w:t>
+        <w:t>10.000 voli memorizzati</w:t>
       </w:r>
     </w:p>
     <w:p>
       <w:pPr>
         <w:pStyle w:val="Titolo2"/>
-        <w:keepNext w:val="0"/>
         <w:keepLines w:val="0"/>
         <w:widowControl w:val="0"/>
         <w:numPr>
-          <w:ilvl w:val="0"/>
-          <w:numId w:val="40"/>
+          <w:ilvl w:val="1"/>
+          <w:numId w:val="41"/>
         </w:numPr>
-        <w:jc w:val="both"/>
-        <w:rPr>
+        <w:rPr>
+          <w:b w:val="0"/>
+          <w:bCs w:val="0"/>
           <w:sz w:val="34"/>
           <w:szCs w:val="34"/>
         </w:rPr>
@@ -4768,26 +4748,18 @@
           <w:szCs w:val="28"/>
           <w:lang w:val="it-IT"/>
         </w:rPr>
-        <w:t>Tutte le funzionalità principali devono essere accessibili senza la necessità di consultare una guida.</w:t>
+        <w:t>50.000 prenotazioni memorizzate</w:t>
       </w:r>
     </w:p>
     <w:p>
       <w:pPr>
         <w:pStyle w:val="Titolo2"/>
-        <w:keepNext w:val="0"/>
         <w:keepLines w:val="0"/>
         <w:widowControl w:val="0"/>
         <w:numPr>
           <w:ilvl w:val="0"/>
-          <w:numId w:val="40"/>
+          <w:numId w:val="41"/>
         </w:numPr>
-        <w:jc w:val="both"/>
-        <w:rPr>
-          <w:sz w:val="34"/>
-          <w:szCs w:val="34"/>
-        </w:rPr>
-      </w:pPr>
-      <w:r>
         <w:rPr>
           <w:b w:val="0"/>
           <w:bCs w:val="0"/>
@@ -4795,55 +4767,6 @@
           <w:szCs w:val="28"/>
           <w:lang w:val="it-IT"/>
         </w:rPr>
-        <w:t>Il sistema deve essere utilizzabile correttamente sia da dispositivi desktop che mobili.</w:t>
-      </w:r>
-    </w:p>
-    <w:p>
-      <w:pPr>
-        <w:pStyle w:val="Titolo2"/>
-        <w:keepLines w:val="0"/>
-        <w:widowControl w:val="0"/>
-        <w:rPr>
-          <w:b w:val="0"/>
-          <w:bCs w:val="0"/>
-          <w:sz w:val="34"/>
-          <w:szCs w:val="34"/>
-        </w:rPr>
-      </w:pPr>
-      <w:r>
-        <w:rPr>
-          <w:sz w:val="34"/>
-          <w:szCs w:val="34"/>
-        </w:rPr>
-        <w:t>RNF4: Scalabilità</w:t>
-      </w:r>
-      <w:bookmarkStart w:id="21" w:name="_8ldwch89ppss" w:colFirst="0" w:colLast="0"/>
-      <w:bookmarkEnd w:id="21"/>
-      <w:r>
-        <w:rPr>
-          <w:b w:val="0"/>
-          <w:bCs w:val="0"/>
-          <w:sz w:val="34"/>
-          <w:szCs w:val="34"/>
-        </w:rPr>
-        <w:t xml:space="preserve"> – priorità bassa</w:t>
-      </w:r>
-    </w:p>
-    <w:p>
-      <w:pPr>
-        <w:pStyle w:val="Titolo2"/>
-        <w:keepLines w:val="0"/>
-        <w:widowControl w:val="0"/>
-        <w:numPr>
-          <w:ilvl w:val="0"/>
-          <w:numId w:val="41"/>
-        </w:numPr>
-        <w:rPr>
-          <w:b w:val="0"/>
-          <w:bCs w:val="0"/>
-          <w:sz w:val="34"/>
-          <w:szCs w:val="34"/>
-        </w:rPr>
       </w:pPr>
       <w:r>
         <w:rPr>
@@ -4853,26 +4776,98 @@
           <w:szCs w:val="28"/>
           <w:lang w:val="it-IT"/>
         </w:rPr>
-        <w:t>Il sistema deve essere in grado di gestire almeno:</w:t>
-      </w:r>
+        <w:t>L’aumento del volume dei dati e del numero di utenti non deve compromettere il corretto funzionamento del sistema.</w:t>
+      </w:r>
+    </w:p>
+    <w:p>
+      <w:pPr>
+        <w:rPr>
+          <w:lang w:val="it-IT"/>
+        </w:rPr>
+      </w:pPr>
+    </w:p>
+    <w:p>
+      <w:pPr>
+        <w:rPr>
+          <w:lang w:val="it-IT"/>
+        </w:rPr>
+      </w:pPr>
+    </w:p>
+    <w:p>
+      <w:pPr>
+        <w:rPr>
+          <w:lang w:val="it-IT"/>
+        </w:rPr>
+      </w:pPr>
+    </w:p>
+    <w:p>
+      <w:pPr>
+        <w:rPr>
+          <w:lang w:val="it-IT"/>
+        </w:rPr>
+      </w:pPr>
+    </w:p>
+    <w:p>
+      <w:pPr>
+        <w:rPr>
+          <w:lang w:val="it-IT"/>
+        </w:rPr>
+      </w:pPr>
+    </w:p>
+    <w:p>
+      <w:pPr>
+        <w:rPr>
+          <w:lang w:val="it-IT"/>
+        </w:rPr>
+      </w:pPr>
+    </w:p>
+    <w:p>
+      <w:pPr>
+        <w:rPr>
+          <w:lang w:val="it-IT"/>
+        </w:rPr>
+      </w:pPr>
+    </w:p>
+    <w:p>
+      <w:pPr>
+        <w:rPr>
+          <w:lang w:val="it-IT"/>
+        </w:rPr>
+      </w:pPr>
+    </w:p>
+    <w:p>
+      <w:pPr>
+        <w:rPr>
+          <w:lang w:val="it-IT"/>
+        </w:rPr>
+      </w:pPr>
+    </w:p>
+    <w:p>
+      <w:pPr>
+        <w:rPr>
+          <w:lang w:val="it-IT"/>
+        </w:rPr>
+      </w:pPr>
+    </w:p>
+    <w:p>
+      <w:pPr>
+        <w:rPr>
+          <w:lang w:val="it-IT"/>
+        </w:rPr>
+      </w:pPr>
+    </w:p>
+    <w:p>
+      <w:pPr>
+        <w:rPr>
+          <w:lang w:val="it-IT"/>
+        </w:rPr>
+      </w:pPr>
     </w:p>
     <w:p>
       <w:pPr>
         <w:pStyle w:val="Titolo2"/>
         <w:keepLines w:val="0"/>
         <w:widowControl w:val="0"/>
-        <w:numPr>
-          <w:ilvl w:val="1"/>
-          <w:numId w:val="41"/>
-        </w:numPr>
-        <w:rPr>
-          <w:b w:val="0"/>
-          <w:bCs w:val="0"/>
-          <w:sz w:val="34"/>
-          <w:szCs w:val="34"/>
-        </w:rPr>
-      </w:pPr>
-      <w:r>
         <w:rPr>
           <w:b w:val="0"/>
           <w:bCs w:val="0"/>
@@ -4880,226 +4875,6 @@
           <w:szCs w:val="28"/>
           <w:lang w:val="it-IT"/>
         </w:rPr>
-        <w:t>1.000 utenti registrati</w:t>
-      </w:r>
-    </w:p>
-    <w:p>
-      <w:pPr>
-        <w:pStyle w:val="Titolo2"/>
-        <w:keepLines w:val="0"/>
-        <w:widowControl w:val="0"/>
-        <w:numPr>
-          <w:ilvl w:val="1"/>
-          <w:numId w:val="41"/>
-        </w:numPr>
-        <w:rPr>
-          <w:b w:val="0"/>
-          <w:bCs w:val="0"/>
-          <w:sz w:val="34"/>
-          <w:szCs w:val="34"/>
-        </w:rPr>
-      </w:pPr>
-      <w:proofErr w:type="gramStart"/>
-      <w:r>
-        <w:rPr>
-          <w:b w:val="0"/>
-          <w:bCs w:val="0"/>
-          <w:sz w:val="28"/>
-          <w:szCs w:val="28"/>
-          <w:lang w:val="it-IT"/>
-        </w:rPr>
-        <w:t>100</w:t>
-      </w:r>
-      <w:proofErr w:type="gramEnd"/>
-      <w:r>
-        <w:rPr>
-          <w:b w:val="0"/>
-          <w:bCs w:val="0"/>
-          <w:sz w:val="28"/>
-          <w:szCs w:val="28"/>
-          <w:lang w:val="it-IT"/>
-        </w:rPr>
-        <w:t xml:space="preserve"> utenti contemporanei</w:t>
-      </w:r>
-    </w:p>
-    <w:p>
-      <w:pPr>
-        <w:pStyle w:val="Titolo2"/>
-        <w:keepLines w:val="0"/>
-        <w:widowControl w:val="0"/>
-        <w:numPr>
-          <w:ilvl w:val="1"/>
-          <w:numId w:val="41"/>
-        </w:numPr>
-        <w:rPr>
-          <w:b w:val="0"/>
-          <w:bCs w:val="0"/>
-          <w:sz w:val="34"/>
-          <w:szCs w:val="34"/>
-        </w:rPr>
-      </w:pPr>
-      <w:r>
-        <w:rPr>
-          <w:b w:val="0"/>
-          <w:bCs w:val="0"/>
-          <w:sz w:val="28"/>
-          <w:szCs w:val="28"/>
-          <w:lang w:val="it-IT"/>
-        </w:rPr>
-        <w:t>10.000 voli memorizzati</w:t>
-      </w:r>
-    </w:p>
-    <w:p>
-      <w:pPr>
-        <w:pStyle w:val="Titolo2"/>
-        <w:keepLines w:val="0"/>
-        <w:widowControl w:val="0"/>
-        <w:numPr>
-          <w:ilvl w:val="1"/>
-          <w:numId w:val="41"/>
-        </w:numPr>
-        <w:rPr>
-          <w:b w:val="0"/>
-          <w:bCs w:val="0"/>
-          <w:sz w:val="34"/>
-          <w:szCs w:val="34"/>
-        </w:rPr>
-      </w:pPr>
-      <w:r>
-        <w:rPr>
-          <w:b w:val="0"/>
-          <w:bCs w:val="0"/>
-          <w:sz w:val="28"/>
-          <w:szCs w:val="28"/>
-          <w:lang w:val="it-IT"/>
-        </w:rPr>
-        <w:t>50.000 prenotazioni memorizzate</w:t>
-      </w:r>
-    </w:p>
-    <w:p>
-      <w:pPr>
-        <w:pStyle w:val="Titolo2"/>
-        <w:keepLines w:val="0"/>
-        <w:widowControl w:val="0"/>
-        <w:numPr>
-          <w:ilvl w:val="0"/>
-          <w:numId w:val="41"/>
-        </w:numPr>
-        <w:rPr>
-          <w:b w:val="0"/>
-          <w:bCs w:val="0"/>
-          <w:sz w:val="28"/>
-          <w:szCs w:val="28"/>
-          <w:lang w:val="it-IT"/>
-        </w:rPr>
-      </w:pPr>
-      <w:r>
-        <w:rPr>
-          <w:b w:val="0"/>
-          <w:bCs w:val="0"/>
-          <w:sz w:val="28"/>
-          <w:szCs w:val="28"/>
-          <w:lang w:val="it-IT"/>
-        </w:rPr>
-        <w:t>L’aumento del volume dei dati e del numero di utenti non deve compromettere il corretto funzionamento del sistema.</w:t>
-      </w:r>
-    </w:p>
-    <w:p>
-      <w:pPr>
-        <w:rPr>
-          <w:lang w:val="it-IT"/>
-        </w:rPr>
-      </w:pPr>
-    </w:p>
-    <w:p>
-      <w:pPr>
-        <w:rPr>
-          <w:lang w:val="it-IT"/>
-        </w:rPr>
-      </w:pPr>
-    </w:p>
-    <w:p>
-      <w:pPr>
-        <w:rPr>
-          <w:lang w:val="it-IT"/>
-        </w:rPr>
-      </w:pPr>
-    </w:p>
-    <w:p>
-      <w:pPr>
-        <w:rPr>
-          <w:lang w:val="it-IT"/>
-        </w:rPr>
-      </w:pPr>
-    </w:p>
-    <w:p>
-      <w:pPr>
-        <w:rPr>
-          <w:lang w:val="it-IT"/>
-        </w:rPr>
-      </w:pPr>
-    </w:p>
-    <w:p>
-      <w:pPr>
-        <w:rPr>
-          <w:lang w:val="it-IT"/>
-        </w:rPr>
-      </w:pPr>
-    </w:p>
-    <w:p>
-      <w:pPr>
-        <w:rPr>
-          <w:lang w:val="it-IT"/>
-        </w:rPr>
-      </w:pPr>
-    </w:p>
-    <w:p>
-      <w:pPr>
-        <w:rPr>
-          <w:lang w:val="it-IT"/>
-        </w:rPr>
-      </w:pPr>
-    </w:p>
-    <w:p>
-      <w:pPr>
-        <w:rPr>
-          <w:lang w:val="it-IT"/>
-        </w:rPr>
-      </w:pPr>
-    </w:p>
-    <w:p>
-      <w:pPr>
-        <w:rPr>
-          <w:lang w:val="it-IT"/>
-        </w:rPr>
-      </w:pPr>
-    </w:p>
-    <w:p>
-      <w:pPr>
-        <w:rPr>
-          <w:lang w:val="it-IT"/>
-        </w:rPr>
-      </w:pPr>
-    </w:p>
-    <w:p>
-      <w:pPr>
-        <w:rPr>
-          <w:lang w:val="it-IT"/>
-        </w:rPr>
-      </w:pPr>
-    </w:p>
-    <w:p>
-      <w:pPr>
-        <w:pStyle w:val="Titolo2"/>
-        <w:keepLines w:val="0"/>
-        <w:widowControl w:val="0"/>
-        <w:rPr>
-          <w:b w:val="0"/>
-          <w:bCs w:val="0"/>
-          <w:sz w:val="28"/>
-          <w:szCs w:val="28"/>
-          <w:lang w:val="it-IT"/>
-        </w:rPr>
       </w:pPr>
       <w:r>
         <w:rPr>
@@ -5284,7 +5059,14 @@
           <w:sz w:val="34"/>
           <w:szCs w:val="34"/>
         </w:rPr>
-        <w:t xml:space="preserve"> – priorità bassa</w:t>
+        <w:t xml:space="preserve"> – priorità </w:t>
+      </w:r>
+      <w:r>
+        <w:rPr>
+          <w:sz w:val="34"/>
+          <w:szCs w:val="34"/>
+        </w:rPr>
+        <w:t>bassa</w:t>
       </w:r>
     </w:p>
     <w:p>
@@ -5886,17 +5668,8 @@
                 <w:sz w:val="24"/>
                 <w:szCs w:val="24"/>
               </w:rPr>
-              <w:t xml:space="preserve">Entry </w:t>
-            </w:r>
-            <w:proofErr w:type="spellStart"/>
-            <w:r>
-              <w:rPr>
-                <w:sz w:val="24"/>
-                <w:szCs w:val="24"/>
-              </w:rPr>
-              <w:t>ondition</w:t>
-            </w:r>
-            <w:proofErr w:type="spellEnd"/>
+              <w:t>Entry ondition</w:t>
+            </w:r>
           </w:p>
         </w:tc>
         <w:tc>
@@ -5958,17 +5731,8 @@
                 <w:sz w:val="24"/>
                 <w:szCs w:val="24"/>
               </w:rPr>
-              <w:t xml:space="preserve">Exit </w:t>
-            </w:r>
-            <w:proofErr w:type="spellStart"/>
-            <w:r>
-              <w:rPr>
-                <w:sz w:val="24"/>
-                <w:szCs w:val="24"/>
-              </w:rPr>
-              <w:t>condition</w:t>
-            </w:r>
-            <w:proofErr w:type="spellEnd"/>
+              <w:t>Exit condition</w:t>
+            </w:r>
           </w:p>
         </w:tc>
         <w:tc>
@@ -6218,17 +5982,8 @@
                 <w:sz w:val="24"/>
                 <w:szCs w:val="24"/>
               </w:rPr>
-              <w:t xml:space="preserve">Entry </w:t>
-            </w:r>
-            <w:proofErr w:type="spellStart"/>
-            <w:r>
-              <w:rPr>
-                <w:sz w:val="24"/>
-                <w:szCs w:val="24"/>
-              </w:rPr>
-              <w:t>condition</w:t>
-            </w:r>
-            <w:proofErr w:type="spellEnd"/>
+              <w:t>Entry condition</w:t>
+            </w:r>
           </w:p>
         </w:tc>
         <w:tc>
@@ -6274,17 +6029,8 @@
                 <w:sz w:val="24"/>
                 <w:szCs w:val="24"/>
               </w:rPr>
-              <w:t xml:space="preserve">Exit </w:t>
-            </w:r>
-            <w:proofErr w:type="spellStart"/>
-            <w:r>
-              <w:rPr>
-                <w:sz w:val="24"/>
-                <w:szCs w:val="24"/>
-              </w:rPr>
-              <w:t>condition</w:t>
-            </w:r>
-            <w:proofErr w:type="spellEnd"/>
+              <w:t>Exit condition</w:t>
+            </w:r>
           </w:p>
         </w:tc>
         <w:tc>
@@ -6708,17 +6454,8 @@
                 <w:sz w:val="24"/>
                 <w:szCs w:val="24"/>
               </w:rPr>
-              <w:t xml:space="preserve">Entry </w:t>
-            </w:r>
-            <w:proofErr w:type="spellStart"/>
-            <w:r>
-              <w:rPr>
-                <w:sz w:val="24"/>
-                <w:szCs w:val="24"/>
-              </w:rPr>
-              <w:t>condition</w:t>
-            </w:r>
-            <w:proofErr w:type="spellEnd"/>
+              <w:t>Entry condition</w:t>
+            </w:r>
           </w:p>
         </w:tc>
         <w:tc>
@@ -6764,17 +6501,8 @@
                 <w:sz w:val="24"/>
                 <w:szCs w:val="24"/>
               </w:rPr>
-              <w:t xml:space="preserve">Exit </w:t>
-            </w:r>
-            <w:proofErr w:type="spellStart"/>
-            <w:r>
-              <w:rPr>
-                <w:sz w:val="24"/>
-                <w:szCs w:val="24"/>
-              </w:rPr>
-              <w:t>condition</w:t>
-            </w:r>
-            <w:proofErr w:type="spellEnd"/>
+              <w:t>Exit condition</w:t>
+            </w:r>
           </w:p>
         </w:tc>
         <w:tc>
@@ -7055,17 +6783,8 @@
                 <w:sz w:val="24"/>
                 <w:szCs w:val="24"/>
               </w:rPr>
-              <w:t xml:space="preserve">Entry </w:t>
-            </w:r>
-            <w:proofErr w:type="spellStart"/>
-            <w:r>
-              <w:rPr>
-                <w:sz w:val="24"/>
-                <w:szCs w:val="24"/>
-              </w:rPr>
-              <w:t>condition</w:t>
-            </w:r>
-            <w:proofErr w:type="spellEnd"/>
+              <w:t>Entry condition</w:t>
+            </w:r>
           </w:p>
         </w:tc>
         <w:tc>
@@ -7134,17 +6853,8 @@
                 <w:sz w:val="24"/>
                 <w:szCs w:val="24"/>
               </w:rPr>
-              <w:t xml:space="preserve">Exit </w:t>
-            </w:r>
-            <w:proofErr w:type="spellStart"/>
-            <w:r>
-              <w:rPr>
-                <w:sz w:val="24"/>
-                <w:szCs w:val="24"/>
-              </w:rPr>
-              <w:t>condition</w:t>
-            </w:r>
-            <w:proofErr w:type="spellEnd"/>
+              <w:t>Exit condition</w:t>
+            </w:r>
           </w:p>
         </w:tc>
         <w:tc>
@@ -7446,17 +7156,8 @@
                 <w:sz w:val="24"/>
                 <w:szCs w:val="24"/>
               </w:rPr>
-              <w:t xml:space="preserve">Entry </w:t>
-            </w:r>
-            <w:proofErr w:type="spellStart"/>
-            <w:r>
-              <w:rPr>
-                <w:sz w:val="24"/>
-                <w:szCs w:val="24"/>
-              </w:rPr>
-              <w:t>condition</w:t>
-            </w:r>
-            <w:proofErr w:type="spellEnd"/>
+              <w:t>Entry condition</w:t>
+            </w:r>
           </w:p>
         </w:tc>
         <w:tc>
@@ -7502,17 +7203,8 @@
                 <w:sz w:val="24"/>
                 <w:szCs w:val="24"/>
               </w:rPr>
-              <w:t xml:space="preserve">Exit </w:t>
-            </w:r>
-            <w:proofErr w:type="spellStart"/>
-            <w:r>
-              <w:rPr>
-                <w:sz w:val="24"/>
-                <w:szCs w:val="24"/>
-              </w:rPr>
-              <w:t>condition</w:t>
-            </w:r>
-            <w:proofErr w:type="spellEnd"/>
+              <w:t>Exit condition</w:t>
+            </w:r>
           </w:p>
         </w:tc>
         <w:tc>
@@ -7838,17 +7530,8 @@
                 <w:sz w:val="24"/>
                 <w:szCs w:val="24"/>
               </w:rPr>
-              <w:t xml:space="preserve">Entry </w:t>
-            </w:r>
-            <w:proofErr w:type="spellStart"/>
-            <w:r>
-              <w:rPr>
-                <w:sz w:val="24"/>
-                <w:szCs w:val="24"/>
-              </w:rPr>
-              <w:t>condition</w:t>
-            </w:r>
-            <w:proofErr w:type="spellEnd"/>
+              <w:t>Entry condition</w:t>
+            </w:r>
           </w:p>
         </w:tc>
         <w:tc>
@@ -7894,17 +7577,8 @@
                 <w:sz w:val="24"/>
                 <w:szCs w:val="24"/>
               </w:rPr>
-              <w:t xml:space="preserve">Exit </w:t>
-            </w:r>
-            <w:proofErr w:type="spellStart"/>
-            <w:r>
-              <w:rPr>
-                <w:sz w:val="24"/>
-                <w:szCs w:val="24"/>
-              </w:rPr>
-              <w:t>condition</w:t>
-            </w:r>
-            <w:proofErr w:type="spellEnd"/>
+              <w:t>Exit condition</w:t>
+            </w:r>
           </w:p>
         </w:tc>
         <w:tc>
@@ -8220,17 +7894,8 @@
                 <w:sz w:val="24"/>
                 <w:szCs w:val="24"/>
               </w:rPr>
-              <w:t xml:space="preserve">Entry </w:t>
-            </w:r>
-            <w:proofErr w:type="spellStart"/>
-            <w:r>
-              <w:rPr>
-                <w:sz w:val="24"/>
-                <w:szCs w:val="24"/>
-              </w:rPr>
-              <w:t>condition</w:t>
-            </w:r>
-            <w:proofErr w:type="spellEnd"/>
+              <w:t>Entry condition</w:t>
+            </w:r>
           </w:p>
         </w:tc>
         <w:tc>
@@ -8283,17 +7948,8 @@
                 <w:sz w:val="24"/>
                 <w:szCs w:val="24"/>
               </w:rPr>
-              <w:t xml:space="preserve">Exit </w:t>
-            </w:r>
-            <w:proofErr w:type="spellStart"/>
-            <w:r>
-              <w:rPr>
-                <w:sz w:val="24"/>
-                <w:szCs w:val="24"/>
-              </w:rPr>
-              <w:t>condition</w:t>
-            </w:r>
-            <w:proofErr w:type="spellEnd"/>
+              <w:t>Exit condition</w:t>
+            </w:r>
           </w:p>
         </w:tc>
         <w:tc>
@@ -8607,17 +8263,8 @@
                 <w:sz w:val="24"/>
                 <w:szCs w:val="24"/>
               </w:rPr>
-              <w:t xml:space="preserve">Entry </w:t>
-            </w:r>
-            <w:proofErr w:type="spellStart"/>
-            <w:r>
-              <w:rPr>
-                <w:sz w:val="24"/>
-                <w:szCs w:val="24"/>
-              </w:rPr>
-              <w:t>condition</w:t>
-            </w:r>
-            <w:proofErr w:type="spellEnd"/>
+              <w:t>Entry condition</w:t>
+            </w:r>
           </w:p>
         </w:tc>
         <w:tc>
@@ -8670,17 +8317,8 @@
                 <w:sz w:val="24"/>
                 <w:szCs w:val="24"/>
               </w:rPr>
-              <w:t xml:space="preserve">Exit </w:t>
-            </w:r>
-            <w:proofErr w:type="spellStart"/>
-            <w:r>
-              <w:rPr>
-                <w:sz w:val="24"/>
-                <w:szCs w:val="24"/>
-              </w:rPr>
-              <w:t>condition</w:t>
-            </w:r>
-            <w:proofErr w:type="spellEnd"/>
+              <w:t>Exit condition</w:t>
+            </w:r>
           </w:p>
         </w:tc>
         <w:tc>
@@ -9017,17 +8655,8 @@
                 <w:sz w:val="24"/>
                 <w:szCs w:val="24"/>
               </w:rPr>
-              <w:t xml:space="preserve">Entry </w:t>
-            </w:r>
-            <w:proofErr w:type="spellStart"/>
-            <w:r>
-              <w:rPr>
-                <w:sz w:val="24"/>
-                <w:szCs w:val="24"/>
-              </w:rPr>
-              <w:t>condition</w:t>
-            </w:r>
-            <w:proofErr w:type="spellEnd"/>
+              <w:t>Entry condition</w:t>
+            </w:r>
           </w:p>
         </w:tc>
         <w:tc>
@@ -9089,17 +8718,8 @@
                 <w:sz w:val="24"/>
                 <w:szCs w:val="24"/>
               </w:rPr>
-              <w:t xml:space="preserve">Exit </w:t>
-            </w:r>
-            <w:proofErr w:type="spellStart"/>
-            <w:r>
-              <w:rPr>
-                <w:sz w:val="24"/>
-                <w:szCs w:val="24"/>
-              </w:rPr>
-              <w:t>condition</w:t>
-            </w:r>
-            <w:proofErr w:type="spellEnd"/>
+              <w:t>Exit condition</w:t>
+            </w:r>
           </w:p>
         </w:tc>
         <w:tc>
@@ -9390,17 +9010,8 @@
                 <w:sz w:val="24"/>
                 <w:szCs w:val="24"/>
               </w:rPr>
-              <w:t xml:space="preserve">Entry </w:t>
-            </w:r>
-            <w:proofErr w:type="spellStart"/>
-            <w:r>
-              <w:rPr>
-                <w:sz w:val="24"/>
-                <w:szCs w:val="24"/>
-              </w:rPr>
-              <w:t>condition</w:t>
-            </w:r>
-            <w:proofErr w:type="spellEnd"/>
+              <w:t>Entry condition</w:t>
+            </w:r>
           </w:p>
         </w:tc>
         <w:tc>
@@ -9520,17 +9131,8 @@
                 <w:sz w:val="24"/>
                 <w:szCs w:val="24"/>
               </w:rPr>
-              <w:t xml:space="preserve">Exit </w:t>
-            </w:r>
-            <w:proofErr w:type="spellStart"/>
-            <w:r>
-              <w:rPr>
-                <w:sz w:val="24"/>
-                <w:szCs w:val="24"/>
-              </w:rPr>
-              <w:t>condition</w:t>
-            </w:r>
-            <w:proofErr w:type="spellEnd"/>
+              <w:t>Exit condition</w:t>
+            </w:r>
           </w:p>
         </w:tc>
         <w:tc>
@@ -9808,17 +9410,8 @@
                 <w:sz w:val="24"/>
                 <w:szCs w:val="24"/>
               </w:rPr>
-              <w:t xml:space="preserve">- L’utente viene reindirizzato alla </w:t>
-            </w:r>
-            <w:proofErr w:type="spellStart"/>
-            <w:r>
-              <w:rPr>
-                <w:sz w:val="24"/>
-                <w:szCs w:val="24"/>
-              </w:rPr>
-              <w:t>HomePage</w:t>
-            </w:r>
-            <w:proofErr w:type="spellEnd"/>
+              <w:t>- L’utente viene reindirizzato alla HomePage</w:t>
+            </w:r>
           </w:p>
           <w:p>
             <w:pPr>
@@ -9852,17 +9445,8 @@
                 <w:sz w:val="24"/>
                 <w:szCs w:val="24"/>
               </w:rPr>
-              <w:t xml:space="preserve">Entry </w:t>
-            </w:r>
-            <w:proofErr w:type="spellStart"/>
-            <w:r>
-              <w:rPr>
-                <w:sz w:val="24"/>
-                <w:szCs w:val="24"/>
-              </w:rPr>
-              <w:t>condition</w:t>
-            </w:r>
-            <w:proofErr w:type="spellEnd"/>
+              <w:t>Entry condition</w:t>
+            </w:r>
           </w:p>
         </w:tc>
         <w:tc>
@@ -9922,17 +9506,8 @@
                 <w:sz w:val="24"/>
                 <w:szCs w:val="24"/>
               </w:rPr>
-              <w:t xml:space="preserve">Exit </w:t>
-            </w:r>
-            <w:proofErr w:type="spellStart"/>
-            <w:r>
-              <w:rPr>
-                <w:sz w:val="24"/>
-                <w:szCs w:val="24"/>
-              </w:rPr>
-              <w:t>condition</w:t>
-            </w:r>
-            <w:proofErr w:type="spellEnd"/>
+              <w:t>Exit condition</w:t>
+            </w:r>
           </w:p>
         </w:tc>
         <w:tc>
@@ -10268,7 +9843,6 @@
                 <w:szCs w:val="24"/>
               </w:rPr>
             </w:pPr>
-            <w:proofErr w:type="spellStart"/>
             <w:r>
               <w:rPr>
                 <w:sz w:val="24"/>
@@ -10276,7 +9850,6 @@
               </w:rPr>
               <w:t>CarrelloVoci</w:t>
             </w:r>
-            <w:proofErr w:type="spellEnd"/>
           </w:p>
         </w:tc>
         <w:tc>
@@ -10518,19 +10091,8 @@
           <w:sz w:val="40"/>
           <w:szCs w:val="40"/>
         </w:rPr>
-        <w:t xml:space="preserve">Dynamic Model – Use Case </w:t>
-      </w:r>
-      <w:proofErr w:type="spellStart"/>
-      <w:r>
-        <w:rPr>
-          <w:b/>
-          <w:bCs/>
-          <w:sz w:val="40"/>
-          <w:szCs w:val="40"/>
-        </w:rPr>
-        <w:t>Diagram</w:t>
-      </w:r>
-      <w:proofErr w:type="spellEnd"/>
+        <w:t>Dynamic Model – Use Case Diagram</w:t>
+      </w:r>
     </w:p>
     <w:p>
       <w:pPr>
@@ -10632,39 +10194,8 @@
           <w:sz w:val="40"/>
           <w:szCs w:val="40"/>
         </w:rPr>
-        <w:t xml:space="preserve">Dynamic Model – </w:t>
-      </w:r>
-      <w:proofErr w:type="spellStart"/>
-      <w:r>
-        <w:rPr>
-          <w:b/>
-          <w:bCs/>
-          <w:sz w:val="40"/>
-          <w:szCs w:val="40"/>
-        </w:rPr>
-        <w:t>Sequence</w:t>
-      </w:r>
-      <w:proofErr w:type="spellEnd"/>
-      <w:r>
-        <w:rPr>
-          <w:b/>
-          <w:bCs/>
-          <w:sz w:val="40"/>
-          <w:szCs w:val="40"/>
-        </w:rPr>
-        <w:t xml:space="preserve"> </w:t>
-      </w:r>
-      <w:proofErr w:type="spellStart"/>
-      <w:r>
-        <w:rPr>
-          <w:b/>
-          <w:bCs/>
-          <w:sz w:val="40"/>
-          <w:szCs w:val="40"/>
-        </w:rPr>
-        <w:t>Diagrams</w:t>
-      </w:r>
-      <w:proofErr w:type="spellEnd"/>
+        <w:t>Dynamic Model – Sequence Diagrams</w:t>
+      </w:r>
     </w:p>
     <w:p>
       <w:pPr>
@@ -12176,37 +11707,8 @@
           <w:szCs w:val="40"/>
         </w:rPr>
         <w:lastRenderedPageBreak/>
-        <w:t xml:space="preserve">Dynamic Model - </w:t>
-      </w:r>
-      <w:r>
-        <w:rPr>
-          <w:b/>
-          <w:bCs/>
-          <w:sz w:val="40"/>
-          <w:szCs w:val="40"/>
-        </w:rPr>
-        <w:t xml:space="preserve">Activity </w:t>
-      </w:r>
-      <w:proofErr w:type="spellStart"/>
-      <w:r>
-        <w:rPr>
-          <w:b/>
-          <w:bCs/>
-          <w:sz w:val="40"/>
-          <w:szCs w:val="40"/>
-        </w:rPr>
-        <w:t>Diagram</w:t>
-      </w:r>
-      <w:r>
-        <w:rPr>
-          <w:b/>
-          <w:bCs/>
-          <w:sz w:val="40"/>
-          <w:szCs w:val="40"/>
-        </w:rPr>
-        <w:t>s</w:t>
-      </w:r>
-      <w:proofErr w:type="spellEnd"/>
+        <w:t>Dynamic Model - Activity Diagrams</w:t>
+      </w:r>
     </w:p>
     <w:p>
       <w:pPr>
@@ -12745,19 +12247,8 @@
           <w:sz w:val="32"/>
           <w:szCs w:val="32"/>
         </w:rPr>
-        <w:t xml:space="preserve">MU1 – </w:t>
-      </w:r>
-      <w:proofErr w:type="spellStart"/>
-      <w:r>
-        <w:rPr>
-          <w:b/>
-          <w:bCs/>
-          <w:sz w:val="32"/>
-          <w:szCs w:val="32"/>
-        </w:rPr>
-        <w:t>HomePage</w:t>
-      </w:r>
-      <w:proofErr w:type="spellEnd"/>
+        <w:t>MU1 – HomePage</w:t>
+      </w:r>
     </w:p>
     <w:p>
       <w:pPr>
@@ -12851,7 +12342,6 @@
         </w:rPr>
         <w:t xml:space="preserve">MU2 - </w:t>
       </w:r>
-      <w:proofErr w:type="spellStart"/>
       <w:r>
         <w:rPr>
           <w:sz w:val="32"/>
@@ -12859,7 +12349,6 @@
         </w:rPr>
         <w:t>PaginaRicerca</w:t>
       </w:r>
-      <w:proofErr w:type="spellEnd"/>
     </w:p>
     <w:p>
       <w:pPr>
@@ -12885,7 +12374,7 @@
           <w:szCs w:val="28"/>
         </w:rPr>
         <w:drawing>
-          <wp:inline distT="0" distB="0" distL="0" distR="0" wp14:anchorId="54D6DAC6" wp14:editId="59AC45FE">
+          <wp:inline distT="0" distB="0" distL="0" distR="0" wp14:anchorId="54D6DAC6" wp14:editId="2DE07685">
             <wp:extent cx="5440680" cy="3688281"/>
             <wp:effectExtent l="0" t="0" r="7620" b="7620"/>
             <wp:docPr id="805747977" name="Immagine 2" descr="Immagine che contiene testo, schermata, software, Pagina Web&#10;&#10;Il contenuto generato dall'IA potrebbe non essere corretto."/>
@@ -12968,21 +12457,12 @@
         </w:rPr>
         <w:t xml:space="preserve"> – </w:t>
       </w:r>
-      <w:proofErr w:type="spellStart"/>
       <w:r>
         <w:rPr>
           <w:sz w:val="32"/>
           <w:szCs w:val="32"/>
         </w:rPr>
-        <w:t>PaginaRicerca</w:t>
-      </w:r>
-      <w:proofErr w:type="spellEnd"/>
-      <w:r>
-        <w:rPr>
-          <w:sz w:val="32"/>
-          <w:szCs w:val="32"/>
-        </w:rPr>
-        <w:t xml:space="preserve"> (esempio compilazione)</w:t>
+        <w:t>PaginaRicerca (esempio compilazione)</w:t>
       </w:r>
     </w:p>
     <w:p>
@@ -13011,7 +12491,7 @@
           <w:szCs w:val="24"/>
         </w:rPr>
         <w:drawing>
-          <wp:inline distT="0" distB="0" distL="0" distR="0" wp14:anchorId="748F095F" wp14:editId="5462498B">
+          <wp:inline distT="0" distB="0" distL="0" distR="0" wp14:anchorId="748F095F" wp14:editId="4C608523">
             <wp:extent cx="5396119" cy="3637915"/>
             <wp:effectExtent l="0" t="0" r="0" b="635"/>
             <wp:docPr id="1574553487" name="Immagine 3" descr="Immagine che contiene testo, schermata, software, Carattere&#10;&#10;Il contenuto generato dall'IA potrebbe non essere corretto."/>
@@ -13093,7 +12573,6 @@
         </w:rPr>
         <w:t xml:space="preserve"> - </w:t>
       </w:r>
-      <w:proofErr w:type="spellStart"/>
       <w:r>
         <w:rPr>
           <w:sz w:val="32"/>
@@ -13101,7 +12580,6 @@
         </w:rPr>
         <w:t>PaginaRisultatiDellaRicerca</w:t>
       </w:r>
-      <w:proofErr w:type="spellEnd"/>
     </w:p>
     <w:p>
       <w:pPr>
@@ -13129,7 +12607,7 @@
           <w:szCs w:val="24"/>
         </w:rPr>
         <w:drawing>
-          <wp:inline distT="0" distB="0" distL="0" distR="0" wp14:anchorId="2B35B838" wp14:editId="560D3976">
+          <wp:inline distT="0" distB="0" distL="0" distR="0" wp14:anchorId="2B35B838" wp14:editId="5DF2F2FC">
             <wp:extent cx="5442581" cy="3676015"/>
             <wp:effectExtent l="0" t="0" r="6350" b="635"/>
             <wp:docPr id="976275248" name="Immagine 4" descr="Immagine che contiene testo, schermata, software, Pagina Web&#10;&#10;Il contenuto generato dall'IA potrebbe non essere corretto."/>
@@ -13261,7 +12739,6 @@
         </w:rPr>
         <w:t xml:space="preserve"> - </w:t>
       </w:r>
-      <w:proofErr w:type="spellStart"/>
       <w:r>
         <w:rPr>
           <w:sz w:val="32"/>
@@ -13269,7 +12746,6 @@
         </w:rPr>
         <w:t>PaginaRegistrazione</w:t>
       </w:r>
-      <w:proofErr w:type="spellEnd"/>
     </w:p>
     <w:p>
       <w:pPr>
@@ -13379,7 +12855,6 @@
         </w:rPr>
         <w:t xml:space="preserve"> - </w:t>
       </w:r>
-      <w:proofErr w:type="spellStart"/>
       <w:r>
         <w:rPr>
           <w:sz w:val="32"/>
@@ -13387,7 +12862,6 @@
         </w:rPr>
         <w:t>PaginaLogin</w:t>
       </w:r>
-      <w:proofErr w:type="spellEnd"/>
     </w:p>
     <w:p>
       <w:pPr>
@@ -13415,7 +12889,7 @@
           <w:szCs w:val="24"/>
         </w:rPr>
         <w:drawing>
-          <wp:inline distT="0" distB="0" distL="0" distR="0" wp14:anchorId="6C8F8FEC" wp14:editId="6B3B1E7B">
+          <wp:inline distT="0" distB="0" distL="0" distR="0" wp14:anchorId="6C8F8FEC" wp14:editId="1C615B29">
             <wp:extent cx="5543852" cy="3742690"/>
             <wp:effectExtent l="0" t="0" r="0" b="0"/>
             <wp:docPr id="864694439" name="Immagine 6" descr="Immagine che contiene testo, schermata, software, Icona del computer&#10;&#10;Il contenuto generato dall'IA potrebbe non essere corretto."/>
@@ -13518,7 +12992,6 @@
         </w:rPr>
         <w:t xml:space="preserve"> - </w:t>
       </w:r>
-      <w:proofErr w:type="spellStart"/>
       <w:r>
         <w:rPr>
           <w:sz w:val="32"/>
@@ -13526,7 +12999,6 @@
         </w:rPr>
         <w:t>PaginaUser</w:t>
       </w:r>
-      <w:proofErr w:type="spellEnd"/>
     </w:p>
     <w:p>
       <w:pPr>
@@ -13636,7 +13108,6 @@
         </w:rPr>
         <w:t xml:space="preserve"> - </w:t>
       </w:r>
-      <w:proofErr w:type="spellStart"/>
       <w:r>
         <w:rPr>
           <w:sz w:val="32"/>
@@ -13644,7 +13115,6 @@
         </w:rPr>
         <w:t>PaginaCarrello</w:t>
       </w:r>
-      <w:proofErr w:type="spellEnd"/>
     </w:p>
     <w:p>
       <w:pPr>
@@ -13672,7 +13142,7 @@
           <w:szCs w:val="24"/>
         </w:rPr>
         <w:drawing>
-          <wp:inline distT="0" distB="0" distL="0" distR="0" wp14:anchorId="1F397322" wp14:editId="34744300">
+          <wp:inline distT="0" distB="0" distL="0" distR="0" wp14:anchorId="1F397322" wp14:editId="67F425F7">
             <wp:extent cx="5600700" cy="3172587"/>
             <wp:effectExtent l="0" t="0" r="0" b="8890"/>
             <wp:docPr id="381448322" name="Immagine 8" descr="Immagine che contiene testo, schermata, Carattere, Pagina Web&#10;&#10;Il contenuto generato dall'IA potrebbe non essere corretto."/>
@@ -13815,7 +13285,6 @@
         </w:rPr>
         <w:t xml:space="preserve"> – </w:t>
       </w:r>
-      <w:proofErr w:type="spellStart"/>
       <w:r>
         <w:rPr>
           <w:sz w:val="32"/>
@@ -13823,7 +13292,6 @@
         </w:rPr>
         <w:t>PaginaPrenotazioni</w:t>
       </w:r>
-      <w:proofErr w:type="spellEnd"/>
     </w:p>
     <w:p>
       <w:pPr>
@@ -14140,7 +13608,6 @@
       </w:pPr>
       <w:bookmarkStart w:id="25" w:name="_8yze7fq8vu6a" w:colFirst="0" w:colLast="0"/>
       <w:bookmarkEnd w:id="25"/>
-      <w:proofErr w:type="spellStart"/>
       <w:r>
         <w:rPr>
           <w:b/>
@@ -14151,7 +13618,6 @@
         </w:rPr>
         <w:t>ClickFly</w:t>
       </w:r>
-      <w:proofErr w:type="spellEnd"/>
       <w:r>
         <w:rPr>
           <w:sz w:val="24"/>
@@ -14191,25 +13657,7 @@
           <w:szCs w:val="24"/>
           <w:lang w:val="it-IT"/>
         </w:rPr>
-        <w:t xml:space="preserve">: l’applicazione </w:t>
-      </w:r>
-      <w:proofErr w:type="spellStart"/>
-      <w:r>
-        <w:rPr>
-          <w:sz w:val="24"/>
-          <w:szCs w:val="24"/>
-          <w:lang w:val="it-IT"/>
-        </w:rPr>
-        <w:t>ClickFly</w:t>
-      </w:r>
-      <w:proofErr w:type="spellEnd"/>
-      <w:r>
-        <w:rPr>
-          <w:sz w:val="24"/>
-          <w:szCs w:val="24"/>
-          <w:lang w:val="it-IT"/>
-        </w:rPr>
-        <w:t xml:space="preserve"> nel suo complesso, comprendente interfaccia utente, logica applicativa e base di dati.</w:t>
+        <w:t>: l’applicazione ClickFly nel suo complesso, comprendente interfaccia utente, logica applicativa e base di dati.</w:t>
       </w:r>
     </w:p>
     <w:p>
@@ -14242,25 +13690,7 @@
           <w:szCs w:val="24"/>
           <w:lang w:val="it-IT"/>
         </w:rPr>
-        <w:t xml:space="preserve">: qualsiasi utilizzatore del sistema </w:t>
-      </w:r>
-      <w:proofErr w:type="spellStart"/>
-      <w:r>
-        <w:rPr>
-          <w:sz w:val="24"/>
-          <w:szCs w:val="24"/>
-          <w:lang w:val="it-IT"/>
-        </w:rPr>
-        <w:t>ClickFly</w:t>
-      </w:r>
-      <w:proofErr w:type="spellEnd"/>
-      <w:r>
-        <w:rPr>
-          <w:sz w:val="24"/>
-          <w:szCs w:val="24"/>
-          <w:lang w:val="it-IT"/>
-        </w:rPr>
-        <w:t>, indipendentemente dallo stato di registrazione o autenticazione.</w:t>
+        <w:t>: qualsiasi utilizzatore del sistema ClickFly, indipendentemente dallo stato di registrazione o autenticazione.</w:t>
       </w:r>
     </w:p>
     <w:p>
@@ -14293,25 +13723,7 @@
           <w:szCs w:val="24"/>
           <w:lang w:val="it-IT"/>
         </w:rPr>
-        <w:t xml:space="preserve">: utente che accede alla piattaforma </w:t>
-      </w:r>
-      <w:proofErr w:type="spellStart"/>
-      <w:r>
-        <w:rPr>
-          <w:sz w:val="24"/>
-          <w:szCs w:val="24"/>
-          <w:lang w:val="it-IT"/>
-        </w:rPr>
-        <w:t>ClickFly</w:t>
-      </w:r>
-      <w:proofErr w:type="spellEnd"/>
-      <w:r>
-        <w:rPr>
-          <w:sz w:val="24"/>
-          <w:szCs w:val="24"/>
-          <w:lang w:val="it-IT"/>
-        </w:rPr>
-        <w:t xml:space="preserve"> senza possedere un account personale.</w:t>
+        <w:t>: utente che accede alla piattaforma ClickFly senza possedere un account personale.</w:t>
       </w:r>
     </w:p>
     <w:p>
@@ -14344,25 +13756,7 @@
           <w:szCs w:val="24"/>
           <w:lang w:val="it-IT"/>
         </w:rPr>
-        <w:t xml:space="preserve">: utente che possiede un account personale sulla piattaforma </w:t>
-      </w:r>
-      <w:proofErr w:type="spellStart"/>
-      <w:r>
-        <w:rPr>
-          <w:sz w:val="24"/>
-          <w:szCs w:val="24"/>
-          <w:lang w:val="it-IT"/>
-        </w:rPr>
-        <w:t>ClickFly</w:t>
-      </w:r>
-      <w:proofErr w:type="spellEnd"/>
-      <w:r>
-        <w:rPr>
-          <w:sz w:val="24"/>
-          <w:szCs w:val="24"/>
-          <w:lang w:val="it-IT"/>
-        </w:rPr>
-        <w:t>.</w:t>
+        <w:t>: utente che possiede un account personale sulla piattaforma ClickFly.</w:t>
       </w:r>
     </w:p>
     <w:p>
@@ -14543,25 +13937,7 @@
           <w:szCs w:val="24"/>
           <w:lang w:val="it-IT"/>
         </w:rPr>
-        <w:t xml:space="preserve">: periodo di interazione tra un utente autenticato e il sistema </w:t>
-      </w:r>
-      <w:proofErr w:type="spellStart"/>
-      <w:r>
-        <w:rPr>
-          <w:sz w:val="24"/>
-          <w:szCs w:val="24"/>
-          <w:lang w:val="it-IT"/>
-        </w:rPr>
-        <w:t>ClickFly</w:t>
-      </w:r>
-      <w:proofErr w:type="spellEnd"/>
-      <w:r>
-        <w:rPr>
-          <w:sz w:val="24"/>
-          <w:szCs w:val="24"/>
-          <w:lang w:val="it-IT"/>
-        </w:rPr>
-        <w:t>.</w:t>
+        <w:t>: periodo di interazione tra un utente autenticato e il sistema ClickFly.</w:t>
       </w:r>
     </w:p>
     <w:p>
@@ -14941,7 +14317,6 @@
           <w:lang w:val="it-IT"/>
         </w:rPr>
       </w:pPr>
-      <w:proofErr w:type="gramStart"/>
       <w:r>
         <w:rPr>
           <w:b/>
@@ -14952,7 +14327,6 @@
         </w:rPr>
         <w:t>Storico prenotazioni</w:t>
       </w:r>
-      <w:proofErr w:type="gramEnd"/>
       <w:r>
         <w:rPr>
           <w:sz w:val="24"/>
@@ -14992,25 +14366,7 @@
           <w:szCs w:val="24"/>
           <w:lang w:val="it-IT"/>
         </w:rPr>
-        <w:t xml:space="preserve">: sistema di memorizzazione persistente utilizzato da </w:t>
-      </w:r>
-      <w:proofErr w:type="spellStart"/>
-      <w:r>
-        <w:rPr>
-          <w:sz w:val="24"/>
-          <w:szCs w:val="24"/>
-          <w:lang w:val="it-IT"/>
-        </w:rPr>
-        <w:t>ClickFly</w:t>
-      </w:r>
-      <w:proofErr w:type="spellEnd"/>
-      <w:r>
-        <w:rPr>
-          <w:sz w:val="24"/>
-          <w:szCs w:val="24"/>
-          <w:lang w:val="it-IT"/>
-        </w:rPr>
-        <w:t xml:space="preserve"> per salvare utenti, voli, carrelli e prenotazioni.</w:t>
+        <w:t>: sistema di memorizzazione persistente utilizzato da ClickFly per salvare utenti, voli, carrelli e prenotazioni.</w:t>
       </w:r>
     </w:p>
     <w:sectPr>

</xml_diff>